<commit_message>
docs(task4): update repo URL to RushikeshGawade01 and capture live GitHub and terminal screenshots
</commit_message>
<xml_diff>
--- a/docs/DevOps_Task4_RushikeshGawade_23102A0052.docx
+++ b/docs/DevOps_Task4_RushikeshGawade_23102A0052.docx
@@ -963,7 +963,7 @@
                       <w:b w:val="0"/>
                       <w:sz w:val="18"/>
                     </w:rPr>
-                    <w:t>https://github.com/rushikesh-gawade/customer-review-moderation-portal.git</w:t>
+                    <w:t>https://github.com/RushikeshGawade01/customer-review-moderation-portal.git</w:t>
                   </w:r>
                 </w:p>
               </w:tc>
@@ -1149,7 +1149,7 @@
                       <w:b w:val="0"/>
                       <w:sz w:val="18"/>
                     </w:rPr>
-                    <w:t>rushikesh.gawade@student.univ.edu</w:t>
+                    <w:t>gawaderushikesh576@gmail.com</w:t>
                   </w:r>
                 </w:p>
               </w:tc>
@@ -1168,7 +1168,7 @@
                       <w:b w:val="0"/>
                       <w:sz w:val="18"/>
                     </w:rPr>
-                    <w:t>Associated institutional email for signed commit verification.</w:t>
+                    <w:t>Associated primary email for signed commit verification.</w:t>
                   </w:r>
                 </w:p>
               </w:tc>
@@ -3730,7 +3730,7 @@
                 <w:rFonts w:ascii="Calibri" w:hAnsi="Calibri"/>
                 <w:sz w:val="22"/>
               </w:rPr>
-              <w:t>The initialized repository was verified live through standard Git CLI commands on PowerShell. The terminal capture confirms clean working tree status, branch tracking, remote URL configuration, and commit log integrity:</w:t>
+              <w:t>The repository was initialized and pushed live to GitHub at https://github.com/RushikeshGawade01/customer-review-moderation-portal. The browser and terminal captures confirm clean working tree status, remote tracking, dual-branch push to main and dev, and commit log integrity:</w:t>
             </w:r>
           </w:p>
           <w:p>
@@ -3742,7 +3742,7 @@
             <w:r>
               <w:drawing>
                 <wp:inline xmlns:a="http://schemas.openxmlformats.org/drawingml/2006/main" xmlns:pic="http://schemas.openxmlformats.org/drawingml/2006/picture">
-                  <wp:extent cx="4937760" cy="2772076"/>
+                  <wp:extent cx="4937760" cy="3163252"/>
                   <wp:docPr id="3" name="Picture 3"/>
                   <wp:cNvGraphicFramePr>
                     <a:graphicFrameLocks noChangeAspect="1"/>
@@ -3751,7 +3751,7 @@
                     <a:graphicData uri="http://schemas.openxmlformats.org/drawingml/2006/picture">
                       <pic:pic>
                         <pic:nvPicPr>
-                          <pic:cNvPr id="0" name="figure_4_2_git_terminal_log.png"/>
+                          <pic:cNvPr id="0" name="github_repo_live.png"/>
                           <pic:cNvPicPr/>
                         </pic:nvPicPr>
                         <pic:blipFill>
@@ -3763,7 +3763,7 @@
                         <pic:spPr>
                           <a:xfrm>
                             <a:off x="0" y="0"/>
-                            <a:ext cx="4937760" cy="2772076"/>
+                            <a:ext cx="4937760" cy="3163252"/>
                           </a:xfrm>
                           <a:prstGeom prst="rect"/>
                         </pic:spPr>
@@ -3786,7 +3786,63 @@
                 <w:b/>
                 <w:sz w:val="20"/>
               </w:rPr>
-              <w:t>Figure 4.2: Terminal Git Log &amp; Repository Initialization Verification (PowerShell Live Execution)</w:t>
+              <w:t>Figure 4.2: Verified Live GitHub Repository (https://github.com/RushikeshGawade01/customer-review-moderation-portal)</w:t>
+            </w:r>
+          </w:p>
+          <w:p>
+            <w:pPr>
+              <w:keepNext/>
+              <w:spacing w:before="120" w:after="40"/>
+              <w:jc w:val="center"/>
+            </w:pPr>
+            <w:r>
+              <w:drawing>
+                <wp:inline xmlns:a="http://schemas.openxmlformats.org/drawingml/2006/main" xmlns:pic="http://schemas.openxmlformats.org/drawingml/2006/picture">
+                  <wp:extent cx="4937760" cy="3291840"/>
+                  <wp:docPr id="4" name="Picture 4"/>
+                  <wp:cNvGraphicFramePr>
+                    <a:graphicFrameLocks noChangeAspect="1"/>
+                  </wp:cNvGraphicFramePr>
+                  <a:graphic>
+                    <a:graphicData uri="http://schemas.openxmlformats.org/drawingml/2006/picture">
+                      <pic:pic>
+                        <pic:nvPicPr>
+                          <pic:cNvPr id="0" name="git_terminal_live.png"/>
+                          <pic:cNvPicPr/>
+                        </pic:nvPicPr>
+                        <pic:blipFill>
+                          <a:blip r:embed="rId25"/>
+                          <a:stretch>
+                            <a:fillRect/>
+                          </a:stretch>
+                        </pic:blipFill>
+                        <pic:spPr>
+                          <a:xfrm>
+                            <a:off x="0" y="0"/>
+                            <a:ext cx="4937760" cy="3291840"/>
+                          </a:xfrm>
+                          <a:prstGeom prst="rect"/>
+                        </pic:spPr>
+                      </pic:pic>
+                    </a:graphicData>
+                  </a:graphic>
+                </wp:inline>
+              </w:drawing>
+            </w:r>
+          </w:p>
+          <w:p>
+            <w:pPr>
+              <w:keepNext/>
+              <w:spacing w:before="40" w:after="160"/>
+              <w:jc w:val="center"/>
+            </w:pPr>
+            <w:r>
+              <w:rPr>
+                <w:rFonts w:ascii="Calibri" w:hAnsi="Calibri"/>
+                <w:b/>
+                <w:sz w:val="20"/>
+              </w:rPr>
+              <w:t>Figure 4.3: Real PowerShell Session Execution (Git User, Remotes, Push to GitHub, and Commit Log)</w:t>
             </w:r>
           </w:p>
         </w:tc>

</xml_diff>